<commit_message>
Updated the Data Input section of OUTLET_APIs.docx.
</commit_message>
<xml_diff>
--- a/Portal_Database_Design/Outlet_APIs.docx
+++ b/Portal_Database_Design/Outlet_APIs.docx
@@ -17,8 +17,8 @@
       </w:tblPr>
       <w:tblGrid>
         <w:gridCol w:w="1922"/>
-        <w:gridCol w:w="2383"/>
-        <w:gridCol w:w="1472"/>
+        <w:gridCol w:w="2382"/>
+        <w:gridCol w:w="1473"/>
         <w:gridCol w:w="1933"/>
         <w:gridCol w:w="1935"/>
       </w:tblGrid>
@@ -76,7 +76,7 @@
         </w:tc>
         <w:tc>
           <w:tcPr>
-            <w:tcW w:w="2383" w:type="dxa"/>
+            <w:tcW w:w="2382" w:type="dxa"/>
             <w:tcBorders>
               <w:top w:val="single" w:sz="4" w:space="0" w:color="000000"/>
               <w:start w:val="single" w:sz="4" w:space="0" w:color="000000"/>
@@ -126,7 +126,7 @@
         </w:tc>
         <w:tc>
           <w:tcPr>
-            <w:tcW w:w="1472" w:type="dxa"/>
+            <w:tcW w:w="1473" w:type="dxa"/>
             <w:tcBorders>
               <w:top w:val="single" w:sz="4" w:space="0" w:color="000000"/>
               <w:start w:val="single" w:sz="4" w:space="0" w:color="000000"/>
@@ -323,30 +323,13 @@
                 <w:szCs w:val="24"/>
                 <w:u w:val="none"/>
               </w:rPr>
-              <w:t>c</w:t>
-            </w:r>
-            <w:r>
-              <w:rPr>
-                <w:b w:val="false"/>
-                <w:bCs w:val="false"/>
-                <w:i w:val="false"/>
-                <w:iCs w:val="false"/>
-                <w:strike w:val="false"/>
-                <w:dstrike w:val="false"/>
-                <w:outline w:val="false"/>
-                <w:shadow w:val="false"/>
-                <w:color w:val="000000"/>
-                <w:sz w:val="24"/>
-                <w:szCs w:val="24"/>
-                <w:u w:val="none"/>
-              </w:rPr>
-              <w:t>reateOutlet</w:t>
-            </w:r>
-          </w:p>
-        </w:tc>
-        <w:tc>
-          <w:tcPr>
-            <w:tcW w:w="2383" w:type="dxa"/>
+              <w:t>createOutlet</w:t>
+            </w:r>
+          </w:p>
+        </w:tc>
+        <w:tc>
+          <w:tcPr>
+            <w:tcW w:w="2382" w:type="dxa"/>
             <w:tcBorders>
               <w:start w:val="single" w:sz="4" w:space="0" w:color="000000"/>
               <w:bottom w:val="single" w:sz="4" w:space="0" w:color="000000"/>
@@ -395,7 +378,7 @@
         </w:tc>
         <w:tc>
           <w:tcPr>
-            <w:tcW w:w="1472" w:type="dxa"/>
+            <w:tcW w:w="1473" w:type="dxa"/>
             <w:tcBorders>
               <w:start w:val="single" w:sz="4" w:space="0" w:color="000000"/>
               <w:bottom w:val="single" w:sz="4" w:space="0" w:color="000000"/>
@@ -487,7 +470,7 @@
                 <w:szCs w:val="24"/>
                 <w:u w:val="none"/>
               </w:rPr>
-              <w:t>All OUTLET fields</w:t>
+              <w:t>createOutletDto</w:t>
             </w:r>
           </w:p>
         </w:tc>
@@ -589,30 +572,13 @@
                 <w:szCs w:val="24"/>
                 <w:u w:val="none"/>
               </w:rPr>
-              <w:t>u</w:t>
-            </w:r>
-            <w:r>
-              <w:rPr>
-                <w:b w:val="false"/>
-                <w:bCs w:val="false"/>
-                <w:i w:val="false"/>
-                <w:iCs w:val="false"/>
-                <w:strike w:val="false"/>
-                <w:dstrike w:val="false"/>
-                <w:outline w:val="false"/>
-                <w:shadow w:val="false"/>
-                <w:color w:val="000000"/>
-                <w:sz w:val="24"/>
-                <w:szCs w:val="24"/>
-                <w:u w:val="none"/>
-              </w:rPr>
-              <w:t>pdateOutletName</w:t>
-            </w:r>
-          </w:p>
-        </w:tc>
-        <w:tc>
-          <w:tcPr>
-            <w:tcW w:w="2383" w:type="dxa"/>
+              <w:t>updateOutletName</w:t>
+            </w:r>
+          </w:p>
+        </w:tc>
+        <w:tc>
+          <w:tcPr>
+            <w:tcW w:w="2382" w:type="dxa"/>
             <w:tcBorders>
               <w:start w:val="single" w:sz="4" w:space="0" w:color="000000"/>
               <w:bottom w:val="single" w:sz="4" w:space="0" w:color="000000"/>
@@ -661,7 +627,7 @@
         </w:tc>
         <w:tc>
           <w:tcPr>
-            <w:tcW w:w="1472" w:type="dxa"/>
+            <w:tcW w:w="1473" w:type="dxa"/>
             <w:tcBorders>
               <w:start w:val="single" w:sz="4" w:space="0" w:color="000000"/>
               <w:bottom w:val="single" w:sz="4" w:space="0" w:color="000000"/>
@@ -753,7 +719,7 @@
                 <w:szCs w:val="24"/>
                 <w:u w:val="none"/>
               </w:rPr>
-              <w:t>outlet_name</w:t>
+              <w:t>outlet_id, updateOutletNameDto</w:t>
             </w:r>
           </w:p>
         </w:tc>
@@ -855,30 +821,13 @@
                 <w:szCs w:val="24"/>
                 <w:u w:val="none"/>
               </w:rPr>
-              <w:t>u</w:t>
-            </w:r>
-            <w:r>
-              <w:rPr>
-                <w:b w:val="false"/>
-                <w:bCs w:val="false"/>
-                <w:i w:val="false"/>
-                <w:iCs w:val="false"/>
-                <w:strike w:val="false"/>
-                <w:dstrike w:val="false"/>
-                <w:outline w:val="false"/>
-                <w:shadow w:val="false"/>
-                <w:color w:val="000000"/>
-                <w:sz w:val="24"/>
-                <w:szCs w:val="24"/>
-                <w:u w:val="none"/>
-              </w:rPr>
-              <w:t>pdateOutletAddress</w:t>
-            </w:r>
-          </w:p>
-        </w:tc>
-        <w:tc>
-          <w:tcPr>
-            <w:tcW w:w="2383" w:type="dxa"/>
+              <w:t>updateOutletAddress</w:t>
+            </w:r>
+          </w:p>
+        </w:tc>
+        <w:tc>
+          <w:tcPr>
+            <w:tcW w:w="2382" w:type="dxa"/>
             <w:tcBorders>
               <w:start w:val="single" w:sz="4" w:space="0" w:color="000000"/>
               <w:bottom w:val="single" w:sz="4" w:space="0" w:color="000000"/>
@@ -927,7 +876,7 @@
         </w:tc>
         <w:tc>
           <w:tcPr>
-            <w:tcW w:w="1472" w:type="dxa"/>
+            <w:tcW w:w="1473" w:type="dxa"/>
             <w:tcBorders>
               <w:start w:val="single" w:sz="4" w:space="0" w:color="000000"/>
               <w:bottom w:val="single" w:sz="4" w:space="0" w:color="000000"/>
@@ -1019,7 +968,7 @@
                 <w:szCs w:val="24"/>
                 <w:u w:val="none"/>
               </w:rPr>
-              <w:t>One or more outlet_address_* fields.</w:t>
+              <w:t>outlet_id, updateOutletAddressDto</w:t>
             </w:r>
           </w:p>
         </w:tc>
@@ -1121,30 +1070,13 @@
                 <w:szCs w:val="24"/>
                 <w:u w:val="none"/>
               </w:rPr>
-              <w:t>u</w:t>
-            </w:r>
-            <w:r>
-              <w:rPr>
-                <w:b w:val="false"/>
-                <w:bCs w:val="false"/>
-                <w:i w:val="false"/>
-                <w:iCs w:val="false"/>
-                <w:strike w:val="false"/>
-                <w:dstrike w:val="false"/>
-                <w:outline w:val="false"/>
-                <w:shadow w:val="false"/>
-                <w:color w:val="000000"/>
-                <w:sz w:val="24"/>
-                <w:szCs w:val="24"/>
-                <w:u w:val="none"/>
-              </w:rPr>
-              <w:t>pdateOutletOwnership</w:t>
-            </w:r>
-          </w:p>
-        </w:tc>
-        <w:tc>
-          <w:tcPr>
-            <w:tcW w:w="2383" w:type="dxa"/>
+              <w:t>updateOutletOwnership</w:t>
+            </w:r>
+          </w:p>
+        </w:tc>
+        <w:tc>
+          <w:tcPr>
+            <w:tcW w:w="2382" w:type="dxa"/>
             <w:tcBorders>
               <w:start w:val="single" w:sz="4" w:space="0" w:color="000000"/>
               <w:bottom w:val="single" w:sz="4" w:space="0" w:color="000000"/>
@@ -1193,7 +1125,7 @@
         </w:tc>
         <w:tc>
           <w:tcPr>
-            <w:tcW w:w="1472" w:type="dxa"/>
+            <w:tcW w:w="1473" w:type="dxa"/>
             <w:tcBorders>
               <w:start w:val="single" w:sz="4" w:space="0" w:color="000000"/>
               <w:bottom w:val="single" w:sz="4" w:space="0" w:color="000000"/>
@@ -1387,30 +1319,13 @@
                 <w:szCs w:val="24"/>
                 <w:u w:val="none"/>
               </w:rPr>
-              <w:t>s</w:t>
-            </w:r>
-            <w:r>
-              <w:rPr>
-                <w:b w:val="false"/>
-                <w:bCs w:val="false"/>
-                <w:i w:val="false"/>
-                <w:iCs w:val="false"/>
-                <w:strike w:val="false"/>
-                <w:dstrike w:val="false"/>
-                <w:outline w:val="false"/>
-                <w:shadow w:val="false"/>
-                <w:color w:val="000000"/>
-                <w:sz w:val="24"/>
-                <w:szCs w:val="24"/>
-                <w:u w:val="none"/>
-              </w:rPr>
-              <w:t>earchOutletsByName</w:t>
-            </w:r>
-          </w:p>
-        </w:tc>
-        <w:tc>
-          <w:tcPr>
-            <w:tcW w:w="2383" w:type="dxa"/>
+              <w:t>searchOutletsByName</w:t>
+            </w:r>
+          </w:p>
+        </w:tc>
+        <w:tc>
+          <w:tcPr>
+            <w:tcW w:w="2382" w:type="dxa"/>
             <w:tcBorders>
               <w:start w:val="single" w:sz="4" w:space="0" w:color="000000"/>
               <w:bottom w:val="single" w:sz="4" w:space="0" w:color="000000"/>
@@ -1459,7 +1374,7 @@
         </w:tc>
         <w:tc>
           <w:tcPr>
-            <w:tcW w:w="1472" w:type="dxa"/>
+            <w:tcW w:w="1473" w:type="dxa"/>
             <w:tcBorders>
               <w:start w:val="single" w:sz="4" w:space="0" w:color="000000"/>
               <w:bottom w:val="single" w:sz="4" w:space="0" w:color="000000"/>
@@ -1551,7 +1466,7 @@
                 <w:szCs w:val="24"/>
                 <w:u w:val="none"/>
               </w:rPr>
-              <w:t>outlet_name</w:t>
+              <w:t>searchOutletDto</w:t>
             </w:r>
           </w:p>
         </w:tc>
@@ -1659,7 +1574,7 @@
         </w:tc>
         <w:tc>
           <w:tcPr>
-            <w:tcW w:w="2383" w:type="dxa"/>
+            <w:tcW w:w="2382" w:type="dxa"/>
             <w:tcBorders>
               <w:start w:val="single" w:sz="4" w:space="0" w:color="000000"/>
               <w:bottom w:val="single" w:sz="4" w:space="0" w:color="000000"/>
@@ -1708,7 +1623,7 @@
         </w:tc>
         <w:tc>
           <w:tcPr>
-            <w:tcW w:w="1472" w:type="dxa"/>
+            <w:tcW w:w="1473" w:type="dxa"/>
             <w:tcBorders>
               <w:start w:val="single" w:sz="4" w:space="0" w:color="000000"/>
               <w:bottom w:val="single" w:sz="4" w:space="0" w:color="000000"/>
@@ -1908,7 +1823,7 @@
         </w:tc>
         <w:tc>
           <w:tcPr>
-            <w:tcW w:w="2383" w:type="dxa"/>
+            <w:tcW w:w="2382" w:type="dxa"/>
             <w:tcBorders>
               <w:start w:val="single" w:sz="4" w:space="0" w:color="000000"/>
               <w:bottom w:val="single" w:sz="4" w:space="0" w:color="000000"/>
@@ -1957,7 +1872,7 @@
         </w:tc>
         <w:tc>
           <w:tcPr>
-            <w:tcW w:w="1472" w:type="dxa"/>
+            <w:tcW w:w="1473" w:type="dxa"/>
             <w:tcBorders>
               <w:start w:val="single" w:sz="4" w:space="0" w:color="000000"/>
               <w:bottom w:val="single" w:sz="4" w:space="0" w:color="000000"/>
@@ -2151,79 +2066,96 @@
                 <w:szCs w:val="24"/>
                 <w:u w:val="none"/>
               </w:rPr>
-              <w:t>d</w:t>
-            </w:r>
-            <w:r>
-              <w:rPr>
-                <w:b w:val="false"/>
-                <w:bCs w:val="false"/>
-                <w:i w:val="false"/>
-                <w:iCs w:val="false"/>
-                <w:strike w:val="false"/>
-                <w:dstrike w:val="false"/>
-                <w:outline w:val="false"/>
-                <w:shadow w:val="false"/>
-                <w:color w:val="000000"/>
-                <w:sz w:val="24"/>
-                <w:szCs w:val="24"/>
-                <w:u w:val="none"/>
-              </w:rPr>
-              <w:t>eleteOutletByName</w:t>
-            </w:r>
-          </w:p>
-        </w:tc>
-        <w:tc>
-          <w:tcPr>
-            <w:tcW w:w="2383" w:type="dxa"/>
-            <w:tcBorders>
-              <w:start w:val="single" w:sz="4" w:space="0" w:color="000000"/>
-              <w:bottom w:val="single" w:sz="4" w:space="0" w:color="000000"/>
-            </w:tcBorders>
-          </w:tcPr>
-          <w:p>
-            <w:pPr>
-              <w:pStyle w:val="TableContents"/>
-              <w:bidi w:val="0"/>
-              <w:jc w:val="start"/>
-              <w:rPr>
-                <w:rFonts w:ascii="Liberation Serif" w:hAnsi="Liberation Serif"/>
-                <w:b w:val="false"/>
-                <w:bCs w:val="false"/>
-                <w:i w:val="false"/>
-                <w:i w:val="false"/>
-                <w:iCs w:val="false"/>
-                <w:strike w:val="false"/>
-                <w:dstrike w:val="false"/>
-                <w:outline w:val="false"/>
-                <w:shadow w:val="false"/>
-                <w:color w:val="000000"/>
-                <w:sz w:val="24"/>
-                <w:szCs w:val="24"/>
-                <w:u w:val="none"/>
-              </w:rPr>
-            </w:pPr>
-            <w:r>
-              <w:rPr>
-                <w:b w:val="false"/>
-                <w:bCs w:val="false"/>
-                <w:i w:val="false"/>
-                <w:iCs w:val="false"/>
-                <w:strike w:val="false"/>
-                <w:dstrike w:val="false"/>
-                <w:outline w:val="false"/>
-                <w:shadow w:val="false"/>
-                <w:color w:val="000000"/>
-                <w:sz w:val="24"/>
-                <w:szCs w:val="24"/>
-                <w:u w:val="none"/>
-              </w:rPr>
-              <w:t>Delete an OUTLET using outlet_name.</w:t>
-            </w:r>
-          </w:p>
-        </w:tc>
-        <w:tc>
-          <w:tcPr>
-            <w:tcW w:w="1472" w:type="dxa"/>
+              <w:t>removeOutlet</w:t>
+            </w:r>
+          </w:p>
+        </w:tc>
+        <w:tc>
+          <w:tcPr>
+            <w:tcW w:w="2382" w:type="dxa"/>
+            <w:tcBorders>
+              <w:start w:val="single" w:sz="4" w:space="0" w:color="000000"/>
+              <w:bottom w:val="single" w:sz="4" w:space="0" w:color="000000"/>
+            </w:tcBorders>
+          </w:tcPr>
+          <w:p>
+            <w:pPr>
+              <w:pStyle w:val="TableContents"/>
+              <w:bidi w:val="0"/>
+              <w:jc w:val="start"/>
+              <w:rPr>
+                <w:rFonts w:ascii="Liberation Serif" w:hAnsi="Liberation Serif"/>
+                <w:b w:val="false"/>
+                <w:bCs w:val="false"/>
+                <w:i w:val="false"/>
+                <w:i w:val="false"/>
+                <w:iCs w:val="false"/>
+                <w:strike w:val="false"/>
+                <w:dstrike w:val="false"/>
+                <w:outline w:val="false"/>
+                <w:shadow w:val="false"/>
+                <w:color w:val="000000"/>
+                <w:sz w:val="24"/>
+                <w:szCs w:val="24"/>
+                <w:u w:val="none"/>
+              </w:rPr>
+            </w:pPr>
+            <w:r>
+              <w:rPr>
+                <w:b w:val="false"/>
+                <w:bCs w:val="false"/>
+                <w:i w:val="false"/>
+                <w:iCs w:val="false"/>
+                <w:strike w:val="false"/>
+                <w:dstrike w:val="false"/>
+                <w:outline w:val="false"/>
+                <w:shadow w:val="false"/>
+                <w:color w:val="000000"/>
+                <w:sz w:val="24"/>
+                <w:szCs w:val="24"/>
+                <w:u w:val="none"/>
+              </w:rPr>
+              <w:t>Delete an OUTLET using outlet_</w:t>
+            </w:r>
+            <w:r>
+              <w:rPr>
+                <w:b w:val="false"/>
+                <w:bCs w:val="false"/>
+                <w:i w:val="false"/>
+                <w:iCs w:val="false"/>
+                <w:strike w:val="false"/>
+                <w:dstrike w:val="false"/>
+                <w:outline w:val="false"/>
+                <w:shadow w:val="false"/>
+                <w:color w:val="000000"/>
+                <w:sz w:val="24"/>
+                <w:szCs w:val="24"/>
+                <w:u w:val="none"/>
+              </w:rPr>
+              <w:t>id</w:t>
+            </w:r>
+            <w:r>
+              <w:rPr>
+                <w:b w:val="false"/>
+                <w:bCs w:val="false"/>
+                <w:i w:val="false"/>
+                <w:iCs w:val="false"/>
+                <w:strike w:val="false"/>
+                <w:dstrike w:val="false"/>
+                <w:outline w:val="false"/>
+                <w:shadow w:val="false"/>
+                <w:color w:val="000000"/>
+                <w:sz w:val="24"/>
+                <w:szCs w:val="24"/>
+                <w:u w:val="none"/>
+              </w:rPr>
+              <w:t>.</w:t>
+            </w:r>
+          </w:p>
+        </w:tc>
+        <w:tc>
+          <w:tcPr>
+            <w:tcW w:w="1473" w:type="dxa"/>
             <w:tcBorders>
               <w:start w:val="single" w:sz="4" w:space="0" w:color="000000"/>
               <w:bottom w:val="single" w:sz="4" w:space="0" w:color="000000"/>
@@ -2315,7 +2247,24 @@
                 <w:szCs w:val="24"/>
                 <w:u w:val="none"/>
               </w:rPr>
-              <w:t>outlet_name</w:t>
+              <w:t>outle</w:t>
+            </w:r>
+            <w:r>
+              <w:rPr>
+                <w:b w:val="false"/>
+                <w:bCs w:val="false"/>
+                <w:i w:val="false"/>
+                <w:iCs w:val="false"/>
+                <w:strike w:val="false"/>
+                <w:dstrike w:val="false"/>
+                <w:outline w:val="false"/>
+                <w:shadow w:val="false"/>
+                <w:color w:val="000000"/>
+                <w:sz w:val="24"/>
+                <w:szCs w:val="24"/>
+                <w:u w:val="none"/>
+              </w:rPr>
+              <w:t>t_id</w:t>
             </w:r>
           </w:p>
         </w:tc>
@@ -2639,21 +2588,10 @@
         </w:rPr>
       </w:pPr>
       <w:r>
-        <w:rPr/>
-      </w:r>
-    </w:p>
-    <w:p>
-      <w:pPr>
-        <w:pStyle w:val="Normal"/>
-        <w:bidi w:val="0"/>
-        <w:jc w:val="center"/>
         <w:rPr>
           <w:b/>
           <w:bCs/>
         </w:rPr>
-      </w:pPr>
-      <w:r>
-        <w:rPr/>
       </w:r>
     </w:p>
     <w:p>
@@ -2667,21 +2605,10 @@
         </w:rPr>
       </w:pPr>
       <w:r>
-        <w:rPr/>
-      </w:r>
-    </w:p>
-    <w:p>
-      <w:pPr>
-        <w:pStyle w:val="Normal"/>
-        <w:bidi w:val="0"/>
-        <w:jc w:val="center"/>
         <w:rPr>
           <w:b/>
           <w:bCs/>
         </w:rPr>
-      </w:pPr>
-      <w:r>
-        <w:rPr/>
       </w:r>
     </w:p>
     <w:p>
@@ -2695,21 +2622,58 @@
         </w:rPr>
       </w:pPr>
       <w:r>
-        <w:rPr/>
-      </w:r>
-    </w:p>
-    <w:p>
-      <w:pPr>
-        <w:pStyle w:val="Normal"/>
-        <w:bidi w:val="0"/>
-        <w:jc w:val="center"/>
-        <w:rPr/>
-      </w:pPr>
-      <w:r>
         <w:rPr>
           <w:b/>
           <w:bCs/>
         </w:rPr>
+      </w:r>
+    </w:p>
+    <w:p>
+      <w:pPr>
+        <w:pStyle w:val="Normal"/>
+        <w:bidi w:val="0"/>
+        <w:jc w:val="center"/>
+        <w:rPr>
+          <w:b/>
+          <w:bCs/>
+        </w:rPr>
+      </w:pPr>
+      <w:r>
+        <w:rPr>
+          <w:b/>
+          <w:bCs/>
+        </w:rPr>
+      </w:r>
+    </w:p>
+    <w:p>
+      <w:pPr>
+        <w:pStyle w:val="Normal"/>
+        <w:bidi w:val="0"/>
+        <w:jc w:val="center"/>
+        <w:rPr>
+          <w:b/>
+          <w:bCs/>
+        </w:rPr>
+      </w:pPr>
+      <w:r>
+        <w:rPr>
+          <w:b/>
+          <w:bCs/>
+        </w:rPr>
+      </w:r>
+    </w:p>
+    <w:p>
+      <w:pPr>
+        <w:pStyle w:val="Normal"/>
+        <w:bidi w:val="0"/>
+        <w:jc w:val="center"/>
+        <w:rPr/>
+      </w:pPr>
+      <w:r>
+        <w:rPr>
+          <w:b/>
+          <w:bCs/>
+        </w:rPr>
         <w:t>INTEGRATION TESTS</w:t>
       </w:r>
     </w:p>
@@ -3161,8 +3125,8 @@
         <w:jc w:val="start"/>
         <w:rPr/>
       </w:pPr>
-      <w:bookmarkStart w:id="7" w:name="__DdeLink__139_2312781727"/>
-      <w:bookmarkStart w:id="8" w:name="__DdeLink__142_2312781727"/>
+      <w:bookmarkStart w:id="7" w:name="__DdeLink__142_2312781727"/>
+      <w:bookmarkStart w:id="8" w:name="__DdeLink__139_2312781727"/>
       <w:r>
         <w:rPr/>
         <w:t>* Delete the OUTLET with outlet_id 8.</w:t>
@@ -3452,8 +3416,8 @@
         <w:rPr/>
         <w:t>* Update the outlet_name of the OUTLET that has oulet_name “</w:t>
       </w:r>
-      <w:bookmarkStart w:id="13" w:name="__DdeLink__283_4095027318"/>
-      <w:bookmarkStart w:id="14" w:name="__DdeLink__265_4095027318"/>
+      <w:bookmarkStart w:id="13" w:name="__DdeLink__265_4095027318"/>
+      <w:bookmarkStart w:id="14" w:name="__DdeLink__283_4095027318"/>
       <w:r>
         <w:rPr/>
         <w:t>Tim Horton’s Test Outlet 2</w:t>
@@ -3541,8 +3505,8 @@
         <w:rPr/>
         <w:t>* Update the chain_id of the OUTLET that has outlet_name “</w:t>
       </w:r>
-      <w:bookmarkStart w:id="17" w:name="__DdeLink__287_4095027318"/>
-      <w:bookmarkStart w:id="18" w:name="__DdeLink__275_4095027318"/>
+      <w:bookmarkStart w:id="17" w:name="__DdeLink__275_4095027318"/>
+      <w:bookmarkStart w:id="18" w:name="__DdeLink__287_4095027318"/>
       <w:r>
         <w:rPr/>
         <w:t>Tim Horton’s Test Outlet 2</w:t>
@@ -3558,8 +3522,8 @@
         <w:rPr/>
         <w:t xml:space="preserve">Check that the respective chain_id has been updated to 2. </w:t>
       </w:r>
-      <w:bookmarkStart w:id="20" w:name="__DdeLink__280_4095027318"/>
-      <w:bookmarkStart w:id="21" w:name="__DdeLink__271_4095027318"/>
+      <w:bookmarkStart w:id="20" w:name="__DdeLink__271_4095027318"/>
+      <w:bookmarkStart w:id="21" w:name="__DdeLink__280_4095027318"/>
       <w:bookmarkEnd w:id="19"/>
       <w:r>
         <w:rPr/>
@@ -3839,7 +3803,7 @@
     <w:pPr>
       <w:widowControl/>
       <w:suppressAutoHyphens w:val="true"/>
-      <w:overflowPunct w:val="false"/>
+      <w:overflowPunct w:val="true"/>
       <w:bidi w:val="0"/>
       <w:spacing w:before="0" w:after="0"/>
       <w:jc w:val="start"/>

</xml_diff>